<commit_message>
Deploying to gh-pages from @ Morrison-Lab/rme@f812b31a0db48ff64d6ffdc246f00004967e9c88 🚀
</commit_message>
<xml_diff>
--- a/chapters/parametric-survival-models-handout.docx
+++ b/chapters/parametric-survival-models-handout.docx
@@ -1300,7 +1300,7 @@
       </w:r>
     </w:p>
     <w:bookmarkEnd w:id="9"/>
-    <w:bookmarkStart w:id="86" w:name="parametric-survival-models"/>
+    <w:bookmarkStart w:id="87" w:name="parametric-survival-models"/>
     <w:p>
       <w:pPr>
         <w:pStyle w:val="Heading1"/>
@@ -5598,7 +5598,7 @@
       </w:tr>
     </w:tbl>
     <w:bookmarkEnd w:id="20"/>
-    <w:bookmarkStart w:id="46" w:name="weibull-distribution"/>
+    <w:bookmarkStart w:id="47" w:name="weibull-distribution"/>
     <w:p>
       <w:pPr>
         <w:pStyle w:val="Heading2"/>
@@ -10075,7 +10075,7 @@
         <w:t xml:space="preserve">Density functions for Weibull distribution</w:t>
       </w:r>
     </w:p>
-    <w:bookmarkStart w:id="45" w:name="properties-of-weibull-hazard-functions"/>
+    <w:bookmarkStart w:id="46" w:name="properties-of-weibull-hazard-functions"/>
     <w:p>
       <w:pPr>
         <w:pStyle w:val="Heading3"/>
@@ -14081,27 +14081,118 @@
               </w:r>
             </w:hyperlink>
             <w:r>
-              <w:t xml:space="preserve"> </w:t>
-            </w:r>
-            <w:r>
-              <w:t xml:space="preserve">and explain how the shape parameter</w:t>
-            </w:r>
-            <w:r>
-              <w:t xml:space="preserve"> </w:t>
-            </w:r>
-            <m:oMath>
-              <m:r>
-                <m:t>p</m:t>
-              </m:r>
-            </m:oMath>
-            <w:r>
-              <w:t xml:space="preserve"> </w:t>
-            </w:r>
-            <w:r>
-              <w:t xml:space="preserve">affects cumulative hazard curves.</w:t>
+              <w:t xml:space="preserve">.</w:t>
             </w:r>
           </w:p>
           <w:bookmarkEnd w:id="36"/>
+        </w:tc>
+      </w:tr>
+    </w:tbl>
+    <w:tbl>
+      <w:tblPr>
+        <w:tblStyle w:val="Table"/>
+        <w:tblInd w:w="164" w:type="dxa"/>
+        <w:tblBorders>
+          <w:left w:val="single" w:sz="24" w:space="0" w:color="909090"/>
+        </w:tblBorders>
+        <w:tblCellMar>
+          <w:left w:w="0" w:type="dxa"/>
+          <w:right w:w="0" w:type="dxa"/>
+        </w:tblCellMar>
+        <w:tblLook w:firstRow="0" w:lastRow="0" w:firstColumn="0" w:lastColumn="0" w:noHBand="0" w:noVBand="0" w:val="0000"/>
+      </w:tblPr>
+      <w:tblGrid>
+        <w:gridCol w:w="7920"/>
+      </w:tblGrid>
+      <w:tr>
+        <w:trPr>
+          <w:cantSplit/>
+        </w:trPr>
+        <w:tc>
+          <w:tcPr>
+            <w:tcMar>
+              <w:left w:w="144" w:type="dxa"/>
+            </w:tcMar>
+          </w:tcPr>
+          <w:p>
+            <w:pPr>
+              <w:pStyle w:val="BodyText"/>
+            </w:pPr>
+            <w:pPr>
+              <w:spacing w:before="16" w:after="64"/>
+            </w:pPr>
+          </w:p>
+          <w:bookmarkStart w:id="37" w:name="exr-weibull-shape"/>
+          <w:p>
+            <w:pPr>
+              <w:pStyle w:val="BodyText"/>
+            </w:pPr>
+            <w:r>
+              <w:rPr>
+                <w:b/>
+                <w:bCs/>
+              </w:rPr>
+              <w:t xml:space="preserve">Exercise 2</w:t>
+            </w:r>
+            <w:r>
+              <w:t xml:space="preserve"> </w:t>
+            </w:r>
+            <w:r>
+              <w:t xml:space="preserve">In the setting of</w:t>
+            </w:r>
+            <w:r>
+              <w:t xml:space="preserve"> </w:t>
+            </w:r>
+            <w:hyperlink w:anchor="exm-weibull-props">
+              <w:r>
+                <w:rPr>
+                  <w:rStyle w:val="Hyperlink"/>
+                </w:rPr>
+                <w:t xml:space="preserve">Example 3</w:t>
+              </w:r>
+            </w:hyperlink>
+            <w:r>
+              <w:t xml:space="preserve">,</w:t>
+            </w:r>
+            <w:r>
+              <w:t xml:space="preserve"> </w:t>
+            </w:r>
+            <w:r>
+              <w:t xml:space="preserve">explain how the shape parameter</w:t>
+            </w:r>
+            <w:r>
+              <w:t xml:space="preserve"> </w:t>
+            </w:r>
+            <m:oMath>
+              <m:r>
+                <m:t>p</m:t>
+              </m:r>
+            </m:oMath>
+            <w:r>
+              <w:t xml:space="preserve"> </w:t>
+            </w:r>
+            <w:r>
+              <w:t xml:space="preserve">affects</w:t>
+            </w:r>
+            <w:r>
+              <w:t xml:space="preserve"> </w:t>
+            </w:r>
+            <w:hyperlink r:id="rId34">
+              <w:r>
+                <w:rPr>
+                  <w:rStyle w:val="Hyperlink"/>
+                </w:rPr>
+                <w:t xml:space="preserve">cumulative hazard</w:t>
+              </w:r>
+            </w:hyperlink>
+            <w:r>
+              <w:t xml:space="preserve"> </w:t>
+            </w:r>
+            <w:r>
+              <w:t xml:space="preserve">curves.</w:t>
+            </w:r>
+          </w:p>
+          <w:bookmarkEnd w:id="37"/>
         </w:tc>
       </w:tr>
     </w:tbl>
@@ -15581,7 +15672,7 @@
             <w:tr>
               <w:tc>
                 <w:tcPr/>
-                <w:bookmarkStart w:id="40" w:name="fig-exm-weibull-hazards"/>
+                <w:bookmarkStart w:id="41" w:name="fig-exm-weibull-hazards"/>
                 <w:p>
                   <w:pPr>
                     <w:pStyle w:val="Compact"/>
@@ -15592,18 +15683,18 @@
                       <wp:inline>
                         <wp:extent cx="4620126" cy="3696101"/>
                         <wp:effectExtent b="0" l="0" r="0" t="0"/>
-                        <wp:docPr descr="" title="" id="38" name="Picture"/>
+                        <wp:docPr descr="" title="" id="39" name="Picture"/>
                         <a:graphic>
                           <a:graphicData uri="http://schemas.openxmlformats.org/drawingml/2006/picture">
                             <pic:pic>
                               <pic:nvPicPr>
-                                <pic:cNvPr descr="parametric-survival-models_files/figure-docx/fig-exm-weibull-hazards-1.png" id="39" name="Picture"/>
+                                <pic:cNvPr descr="parametric-survival-models_files/figure-docx/fig-exm-weibull-hazards-1.png" id="40" name="Picture"/>
                                 <pic:cNvPicPr>
                                   <a:picLocks noChangeArrowheads="1" noChangeAspect="1"/>
                                 </pic:cNvPicPr>
                               </pic:nvPicPr>
                               <pic:blipFill>
-                                <a:blip r:embed="rId37"/>
+                                <a:blip r:embed="rId38"/>
                                 <a:stretch>
                                   <a:fillRect/>
                                 </a:stretch>
@@ -15643,7 +15734,7 @@
                     <w:t xml:space="preserve">Figure 1: Hazard functions for Weibull distribution</w:t>
                   </w:r>
                 </w:p>
-                <w:bookmarkEnd w:id="40"/>
+                <w:bookmarkEnd w:id="41"/>
               </w:tc>
             </w:tr>
           </w:tbl>
@@ -17299,7 +17390,7 @@
             <w:tr>
               <w:tc>
                 <w:tcPr/>
-                <w:bookmarkStart w:id="44" w:name="fig-surv-weibull"/>
+                <w:bookmarkStart w:id="45" w:name="fig-surv-weibull"/>
                 <w:p>
                   <w:pPr>
                     <w:pStyle w:val="Compact"/>
@@ -17310,18 +17401,18 @@
                       <wp:inline>
                         <wp:extent cx="4620126" cy="3696101"/>
                         <wp:effectExtent b="0" l="0" r="0" t="0"/>
-                        <wp:docPr descr="" title="" id="42" name="Picture"/>
+                        <wp:docPr descr="" title="" id="43" name="Picture"/>
                         <a:graphic>
                           <a:graphicData uri="http://schemas.openxmlformats.org/drawingml/2006/picture">
                             <pic:pic>
                               <pic:nvPicPr>
-                                <pic:cNvPr descr="parametric-survival-models_files/figure-docx/fig-surv-weibull-1.png" id="43" name="Picture"/>
+                                <pic:cNvPr descr="parametric-survival-models_files/figure-docx/fig-surv-weibull-1.png" id="44" name="Picture"/>
                                 <pic:cNvPicPr>
                                   <a:picLocks noChangeArrowheads="1" noChangeAspect="1"/>
                                 </pic:cNvPicPr>
                               </pic:nvPicPr>
                               <pic:blipFill>
-                                <a:blip r:embed="rId41"/>
+                                <a:blip r:embed="rId42"/>
                                 <a:stretch>
                                   <a:fillRect/>
                                 </a:stretch>
@@ -17361,16 +17452,16 @@
                     <w:t xml:space="preserve">Figure 2: Survival functions for Weibull distribution</w:t>
                   </w:r>
                 </w:p>
-                <w:bookmarkEnd w:id="44"/>
+                <w:bookmarkEnd w:id="45"/>
               </w:tc>
             </w:tr>
           </w:tbl>
         </w:tc>
       </w:tr>
     </w:tbl>
-    <w:bookmarkEnd w:id="45"/>
     <w:bookmarkEnd w:id="46"/>
-    <w:bookmarkStart w:id="58" w:name="exponential-regression"/>
+    <w:bookmarkEnd w:id="47"/>
+    <w:bookmarkStart w:id="59" w:name="exponential-regression"/>
     <w:p>
       <w:pPr>
         <w:pStyle w:val="Heading2"/>
@@ -17413,7 +17504,7 @@
               <w:spacing w:before="16" w:after="64"/>
             </w:pPr>
           </w:p>
-          <w:bookmarkStart w:id="50" w:name="def-exp-reg"/>
+          <w:bookmarkStart w:id="51" w:name="def-exp-reg"/>
           <w:p>
             <w:pPr>
               <w:pStyle w:val="BodyText"/>
@@ -17464,7 +17555,7 @@
             <w:r>
               <w:t xml:space="preserve"> </w:t>
             </w:r>
-            <w:hyperlink r:id="rId47">
+            <w:hyperlink r:id="rId48">
               <w:r>
                 <w:rPr>
                   <w:rStyle w:val="Hyperlink"/>
@@ -17562,7 +17653,7 @@
             <w:r>
               <w:t xml:space="preserve"> </w:t>
             </w:r>
-            <w:hyperlink r:id="rId48">
+            <w:hyperlink r:id="rId49">
               <w:r>
                 <w:rPr>
                   <w:rStyle w:val="Hyperlink"/>
@@ -17578,16 +17669,16 @@
             <w:pPr>
               <w:pStyle w:val="BodyText"/>
             </w:pPr>
-            <w:bookmarkStart w:id="49" w:name="eq-exp-reg-haz"/>
+            <w:bookmarkStart w:id="50" w:name="eq-exp-reg-haz"/>
             <w:r>
               <w:t xml:space="preserve">$$
     {\lambda}(t \mid \mathord{\smash[b]{\underset{\raise.3ex\hbox{$\scriptstyle\sim$}}{x}}\vphantom{x}}) \stackrel{\text{def}}{=}{\operatorname{exp}\mathopen{}\left\{\eta(\mathord{\smash[b]{\underset{\raise.3ex\hbox{$\scriptstyle\sim$}}{x}}\vphantom{x}})\right\}\mathclose{}},
     \quad \eta(\mathord{\smash[b]{\underset{\raise.3ex\hbox{$\scriptstyle\sim$}}{x}}\vphantom{x}}) \stackrel{\text{def}}{=}\mathord{\smash[b]{\underset{\raise.3ex\hbox{$\scriptstyle\sim$}}{x}}\vphantom{x}}\cdot \mathord{\smash[b]{\underset{\raise.3ex\hbox{$\scriptstyle\sim$}}{\beta}}\vphantom{\beta}}= \beta_0 + \beta_1 x_1 + \dots + \beta_p x_p
      \qquad(1)$$</w:t>
             </w:r>
-            <w:bookmarkEnd w:id="49"/>
+            <w:bookmarkEnd w:id="50"/>
           </w:p>
-          <w:bookmarkEnd w:id="50"/>
+          <w:bookmarkEnd w:id="51"/>
         </w:tc>
       </w:tr>
     </w:tbl>
@@ -17625,7 +17716,7 @@
               <w:spacing w:before="16" w:after="64"/>
             </w:pPr>
           </w:p>
-          <w:bookmarkStart w:id="51" w:name="exm-exp-reg"/>
+          <w:bookmarkStart w:id="52" w:name="exm-exp-reg"/>
           <w:p>
             <w:pPr>
               <w:pStyle w:val="BodyText"/>
@@ -18494,7 +18585,7 @@
               <w:t xml:space="preserve">weeks on the standard treatment.</w:t>
             </w:r>
           </w:p>
-          <w:bookmarkEnd w:id="51"/>
+          <w:bookmarkEnd w:id="52"/>
         </w:tc>
       </w:tr>
     </w:tbl>
@@ -18508,7 +18599,7 @@
       <w:r>
         <w:t xml:space="preserve"> </w:t>
       </w:r>
-      <w:hyperlink r:id="rId52">
+      <w:hyperlink r:id="rId53">
         <w:r>
           <w:rPr>
             <w:rStyle w:val="Hyperlink"/>
@@ -18577,7 +18668,7 @@
       <w:r>
         <w:t xml:space="preserve"> </w:t>
       </w:r>
-      <w:hyperlink r:id="rId47">
+      <w:hyperlink r:id="rId48">
         <w:r>
           <w:rPr>
             <w:rStyle w:val="Hyperlink"/>
@@ -18600,7 +18691,7 @@
       <w:r>
         <w:t xml:space="preserve"> </w:t>
       </w:r>
-      <w:hyperlink r:id="rId53">
+      <w:hyperlink r:id="rId54">
         <w:r>
           <w:rPr>
             <w:rStyle w:val="Hyperlink"/>
@@ -18674,7 +18765,7 @@
       <w:r>
         <w:t xml:space="preserve"> </w:t>
       </w:r>
-      <w:hyperlink r:id="rId54">
+      <w:hyperlink r:id="rId55">
         <w:r>
           <w:rPr>
             <w:rStyle w:val="Hyperlink"/>
@@ -18691,7 +18782,7 @@
       <w:r>
         <w:t xml:space="preserve"> </w:t>
       </w:r>
-      <w:hyperlink r:id="rId55">
+      <w:hyperlink r:id="rId56">
         <w:r>
           <w:rPr>
             <w:rStyle w:val="Hyperlink"/>
@@ -18725,7 +18816,7 @@
       <w:r>
         <w:t xml:space="preserve"> </w:t>
       </w:r>
-      <w:hyperlink r:id="rId56">
+      <w:hyperlink r:id="rId57">
         <w:r>
           <w:rPr>
             <w:rStyle w:val="Hyperlink"/>
@@ -18789,7 +18880,7 @@
       <w:r>
         <w:t xml:space="preserve"> </w:t>
       </w:r>
-      <w:hyperlink r:id="rId57">
+      <w:hyperlink r:id="rId58">
         <w:r>
           <w:rPr>
             <w:rStyle w:val="Hyperlink"/>
@@ -18804,8 +18895,8 @@
         <w:t xml:space="preserve">trivially.</w:t>
       </w:r>
     </w:p>
-    <w:bookmarkEnd w:id="58"/>
-    <w:bookmarkStart w:id="74" w:name="accelerated-failure-time"/>
+    <w:bookmarkEnd w:id="59"/>
+    <w:bookmarkStart w:id="75" w:name="accelerated-failure-time"/>
     <w:p>
       <w:pPr>
         <w:pStyle w:val="Heading2"/>
@@ -18824,7 +18915,7 @@
       <w:r>
         <w:t xml:space="preserve"> </w:t>
       </w:r>
-      <w:hyperlink r:id="rId59">
+      <w:hyperlink r:id="rId60">
         <w:r>
           <w:rPr>
             <w:rStyle w:val="Hyperlink"/>
@@ -18838,7 +18929,7 @@
       <w:r>
         <w:t xml:space="preserve"> </w:t>
       </w:r>
-      <w:hyperlink r:id="rId53">
+      <w:hyperlink r:id="rId54">
         <w:r>
           <w:rPr>
             <w:rStyle w:val="Hyperlink"/>
@@ -18933,7 +19024,7 @@
               <w:spacing w:before="16" w:after="64"/>
             </w:pPr>
           </w:p>
-          <w:bookmarkStart w:id="60" w:name="def-acceleration-factor"/>
+          <w:bookmarkStart w:id="61" w:name="def-acceleration-factor"/>
           <w:p>
             <w:pPr>
               <w:pStyle w:val="BodyText"/>
@@ -19058,175 +19149,6 @@
             <w:r>
               <w:t xml:space="preserve">$$
     \theta_{{\lambda}}(\mathord{\smash[b]{\underset{\raise.3ex\hbox{$\scriptstyle\sim$}}{x}}\vphantom{x}}) \stackrel{\text{def}}{=}{\operatorname{exp}\mathopen{}\left\{\eta(\mathord{\smash[b]{\underset{\raise.3ex\hbox{$\scriptstyle\sim$}}{x}}\vphantom{x}})\right\}\mathclose{}}.
-    $$</w:t>
-            </w:r>
-          </w:p>
-          <w:bookmarkEnd w:id="60"/>
-        </w:tc>
-      </w:tr>
-    </w:tbl>
-    <w:tbl>
-      <w:tblPr>
-        <w:tblStyle w:val="Table"/>
-        <w:tblInd w:w="164" w:type="dxa"/>
-        <w:tblBorders>
-          <w:left w:val="single" w:sz="24" w:space="0" w:color="909090"/>
-        </w:tblBorders>
-        <w:tblCellMar>
-          <w:left w:w="0" w:type="dxa"/>
-          <w:right w:w="0" w:type="dxa"/>
-        </w:tblCellMar>
-        <w:tblLook w:firstRow="0" w:lastRow="0" w:firstColumn="0" w:lastColumn="0" w:noHBand="0" w:noVBand="0" w:val="0000"/>
-      </w:tblPr>
-      <w:tblGrid>
-        <w:gridCol w:w="7920"/>
-      </w:tblGrid>
-      <w:tr>
-        <w:trPr>
-          <w:cantSplit/>
-        </w:trPr>
-        <w:tc>
-          <w:tcPr>
-            <w:tcMar>
-              <w:left w:w="144" w:type="dxa"/>
-            </w:tcMar>
-          </w:tcPr>
-          <w:p>
-            <w:pPr>
-              <w:pStyle w:val="FirstParagraph"/>
-            </w:pPr>
-            <w:pPr>
-              <w:spacing w:before="16" w:after="64"/>
-            </w:pPr>
-          </w:p>
-          <w:bookmarkStart w:id="61" w:name="exm-acceleration-factor"/>
-          <w:p>
-            <w:pPr>
-              <w:pStyle w:val="BodyText"/>
-            </w:pPr>
-            <w:r>
-              <w:rPr>
-                <w:b/>
-                <w:bCs/>
-              </w:rPr>
-              <w:t xml:space="preserve">Example 5 (Computing an acceleration factor)</w:t>
-            </w:r>
-            <w:r>
-              <w:t xml:space="preserve"> </w:t>
-            </w:r>
-            <w:r>
-              <w:t xml:space="preserve">Suppose there is one covariate, with coefficient</w:t>
-            </w:r>
-            <w:r>
-              <w:t xml:space="preserve"> </w:t>
-            </w:r>
-            <m:oMath>
-              <m:sSub>
-                <m:e>
-                  <m:r>
-                    <m:t>β</m:t>
-                  </m:r>
-                </m:e>
-                <m:sub>
-                  <m:r>
-                    <m:t>1</m:t>
-                  </m:r>
-                </m:sub>
-              </m:sSub>
-              <m:r>
-                <m:rPr>
-                  <m:sty m:val="p"/>
-                </m:rPr>
-                <m:t>=</m:t>
-              </m:r>
-              <m:r>
-                <m:rPr>
-                  <m:sty m:val="p"/>
-                </m:rPr>
-                <m:t>log</m:t>
-              </m:r>
-              <m:r>
-                <m:t>​</m:t>
-              </m:r>
-              <m:d>
-                <m:dPr>
-                  <m:begChr m:val="{"/>
-                  <m:sepChr m:val=""/>
-                  <m:endChr m:val="}"/>
-                  <m:grow/>
-                </m:dPr>
-                <m:e>
-                  <m:r>
-                    <m:t>2</m:t>
-                  </m:r>
-                </m:e>
-              </m:d>
-              <m:r>
-                <m:t>​</m:t>
-              </m:r>
-            </m:oMath>
-            <w:r>
-              <w:t xml:space="preserve">,</w:t>
-            </w:r>
-            <w:r>
-              <w:t xml:space="preserve"> </w:t>
-            </w:r>
-            <w:r>
-              <w:t xml:space="preserve">and a subject has</w:t>
-            </w:r>
-            <w:r>
-              <w:t xml:space="preserve"> </w:t>
-            </w:r>
-            <m:oMath>
-              <m:sSub>
-                <m:e>
-                  <m:r>
-                    <m:t>x</m:t>
-                  </m:r>
-                </m:e>
-                <m:sub>
-                  <m:r>
-                    <m:t>1</m:t>
-                  </m:r>
-                </m:sub>
-              </m:sSub>
-              <m:r>
-                <m:rPr>
-                  <m:sty m:val="p"/>
-                </m:rPr>
-                <m:t>=</m:t>
-              </m:r>
-              <m:r>
-                <m:t>2</m:t>
-              </m:r>
-            </m:oMath>
-            <w:r>
-              <w:t xml:space="preserve">.</w:t>
-            </w:r>
-            <w:r>
-              <w:t xml:space="preserve"> </w:t>
-            </w:r>
-            <w:r>
-              <w:t xml:space="preserve">Then:</w:t>
-            </w:r>
-          </w:p>
-          <w:p>
-            <w:pPr>
-              <w:pStyle w:val="BodyText"/>
-            </w:pPr>
-            <w:r>
-              <w:t xml:space="preserve">$$
-    \begin{aligned}
-    \theta_{{\lambda}}(\mathord{\smash[b]{\underset{\raise.3ex\hbox{$\scriptstyle\sim$}}{x}}\vphantom{x}})
-    &amp;= {\operatorname{exp}\mathopen{}\left\{\eta(\mathord{\smash[b]{\underset{\raise.3ex\hbox{$\scriptstyle\sim$}}{x}}\vphantom{x}})\right\}\mathclose{}}
-    &amp;&amp; \text{(definition of the acceleration factor)} \\
-    &amp;= {\operatorname{exp}\mathopen{}\left\{\beta_1 x_1\right\}\mathclose{}}
-    &amp;&amp; \text{(one covariate, no intercept)} \\
-    &amp;= {\operatorname{exp}\mathopen{}\left\{2 {\operatorname{log}\mathopen{}\left\{2\right\}\mathclose{}}\right\}\mathclose{}}
-    &amp;&amp; \text{(substitute } \beta_1 = {\operatorname{log}\mathopen{}\left\{2\right\}\mathclose{}} \text{ and } x_1 = 2 \text{)} \\
-    &amp;= 4
-    &amp;&amp; \text{(} {\operatorname{exp}\mathopen{}\left\{{\operatorname{log}\mathopen{}\left\{a\right\}\mathclose{}}\right\}\mathclose{}} = a \text{, and } 2 {\operatorname{log}\mathopen{}\left\{2\right\}\mathclose{}} = {\operatorname{log}\mathopen{}\left\{4\right\}\mathclose{}} \text{)}
-    \end{aligned}
     $$</w:t>
             </w:r>
           </w:p>
@@ -19268,7 +19190,176 @@
               <w:spacing w:before="16" w:after="64"/>
             </w:pPr>
           </w:p>
-          <w:bookmarkStart w:id="64" w:name="def-aft"/>
+          <w:bookmarkStart w:id="62" w:name="exm-acceleration-factor"/>
+          <w:p>
+            <w:pPr>
+              <w:pStyle w:val="BodyText"/>
+            </w:pPr>
+            <w:r>
+              <w:rPr>
+                <w:b/>
+                <w:bCs/>
+              </w:rPr>
+              <w:t xml:space="preserve">Example 5 (Computing an acceleration factor)</w:t>
+            </w:r>
+            <w:r>
+              <w:t xml:space="preserve"> </w:t>
+            </w:r>
+            <w:r>
+              <w:t xml:space="preserve">Suppose there is one covariate, with coefficient</w:t>
+            </w:r>
+            <w:r>
+              <w:t xml:space="preserve"> </w:t>
+            </w:r>
+            <m:oMath>
+              <m:sSub>
+                <m:e>
+                  <m:r>
+                    <m:t>β</m:t>
+                  </m:r>
+                </m:e>
+                <m:sub>
+                  <m:r>
+                    <m:t>1</m:t>
+                  </m:r>
+                </m:sub>
+              </m:sSub>
+              <m:r>
+                <m:rPr>
+                  <m:sty m:val="p"/>
+                </m:rPr>
+                <m:t>=</m:t>
+              </m:r>
+              <m:r>
+                <m:rPr>
+                  <m:sty m:val="p"/>
+                </m:rPr>
+                <m:t>log</m:t>
+              </m:r>
+              <m:r>
+                <m:t>​</m:t>
+              </m:r>
+              <m:d>
+                <m:dPr>
+                  <m:begChr m:val="{"/>
+                  <m:sepChr m:val=""/>
+                  <m:endChr m:val="}"/>
+                  <m:grow/>
+                </m:dPr>
+                <m:e>
+                  <m:r>
+                    <m:t>2</m:t>
+                  </m:r>
+                </m:e>
+              </m:d>
+              <m:r>
+                <m:t>​</m:t>
+              </m:r>
+            </m:oMath>
+            <w:r>
+              <w:t xml:space="preserve">,</w:t>
+            </w:r>
+            <w:r>
+              <w:t xml:space="preserve"> </w:t>
+            </w:r>
+            <w:r>
+              <w:t xml:space="preserve">and a subject has</w:t>
+            </w:r>
+            <w:r>
+              <w:t xml:space="preserve"> </w:t>
+            </w:r>
+            <m:oMath>
+              <m:sSub>
+                <m:e>
+                  <m:r>
+                    <m:t>x</m:t>
+                  </m:r>
+                </m:e>
+                <m:sub>
+                  <m:r>
+                    <m:t>1</m:t>
+                  </m:r>
+                </m:sub>
+              </m:sSub>
+              <m:r>
+                <m:rPr>
+                  <m:sty m:val="p"/>
+                </m:rPr>
+                <m:t>=</m:t>
+              </m:r>
+              <m:r>
+                <m:t>2</m:t>
+              </m:r>
+            </m:oMath>
+            <w:r>
+              <w:t xml:space="preserve">.</w:t>
+            </w:r>
+            <w:r>
+              <w:t xml:space="preserve"> </w:t>
+            </w:r>
+            <w:r>
+              <w:t xml:space="preserve">Then:</w:t>
+            </w:r>
+          </w:p>
+          <w:p>
+            <w:pPr>
+              <w:pStyle w:val="BodyText"/>
+            </w:pPr>
+            <w:r>
+              <w:t xml:space="preserve">$$
+    \begin{aligned}
+    \theta_{{\lambda}}(\mathord{\smash[b]{\underset{\raise.3ex\hbox{$\scriptstyle\sim$}}{x}}\vphantom{x}})
+    &amp;= {\operatorname{exp}\mathopen{}\left\{\eta(\mathord{\smash[b]{\underset{\raise.3ex\hbox{$\scriptstyle\sim$}}{x}}\vphantom{x}})\right\}\mathclose{}}
+    &amp;&amp; \text{(definition of the acceleration factor)} \\
+    &amp;= {\operatorname{exp}\mathopen{}\left\{\beta_1 x_1\right\}\mathclose{}}
+    &amp;&amp; \text{(one covariate, no intercept)} \\
+    &amp;= {\operatorname{exp}\mathopen{}\left\{2 {\operatorname{log}\mathopen{}\left\{2\right\}\mathclose{}}\right\}\mathclose{}}
+    &amp;&amp; \text{(substitute } \beta_1 = {\operatorname{log}\mathopen{}\left\{2\right\}\mathclose{}} \text{ and } x_1 = 2 \text{)} \\
+    &amp;= 4
+    &amp;&amp; \text{(} {\operatorname{exp}\mathopen{}\left\{{\operatorname{log}\mathopen{}\left\{a\right\}\mathclose{}}\right\}\mathclose{}} = a \text{, and } 2 {\operatorname{log}\mathopen{}\left\{2\right\}\mathclose{}} = {\operatorname{log}\mathopen{}\left\{4\right\}\mathclose{}} \text{)}
+    \end{aligned}
+    $$</w:t>
+            </w:r>
+          </w:p>
+          <w:bookmarkEnd w:id="62"/>
+        </w:tc>
+      </w:tr>
+    </w:tbl>
+    <w:tbl>
+      <w:tblPr>
+        <w:tblStyle w:val="Table"/>
+        <w:tblInd w:w="164" w:type="dxa"/>
+        <w:tblBorders>
+          <w:left w:val="single" w:sz="24" w:space="0" w:color="909090"/>
+        </w:tblBorders>
+        <w:tblCellMar>
+          <w:left w:w="0" w:type="dxa"/>
+          <w:right w:w="0" w:type="dxa"/>
+        </w:tblCellMar>
+        <w:tblLook w:firstRow="0" w:lastRow="0" w:firstColumn="0" w:lastColumn="0" w:noHBand="0" w:noVBand="0" w:val="0000"/>
+      </w:tblPr>
+      <w:tblGrid>
+        <w:gridCol w:w="7920"/>
+      </w:tblGrid>
+      <w:tr>
+        <w:trPr>
+          <w:cantSplit/>
+        </w:trPr>
+        <w:tc>
+          <w:tcPr>
+            <w:tcMar>
+              <w:left w:w="144" w:type="dxa"/>
+            </w:tcMar>
+          </w:tcPr>
+          <w:p>
+            <w:pPr>
+              <w:pStyle w:val="FirstParagraph"/>
+            </w:pPr>
+            <w:pPr>
+              <w:spacing w:before="16" w:after="64"/>
+            </w:pPr>
+          </w:p>
+          <w:bookmarkStart w:id="65" w:name="def-aft"/>
           <w:p>
             <w:pPr>
               <w:pStyle w:val="BodyText"/>
@@ -19333,13 +19424,13 @@
             <w:pPr>
               <w:pStyle w:val="BodyText"/>
             </w:pPr>
-            <w:bookmarkStart w:id="62" w:name="eq-aft-surv"/>
+            <w:bookmarkStart w:id="63" w:name="eq-aft-surv"/>
             <w:r>
               <w:t xml:space="preserve">$$
     \operatorname{S}(t \mid \mathord{\smash[b]{\underset{\raise.3ex\hbox{$\scriptstyle\sim$}}{x}}\vphantom{x}}) \stackrel{\text{def}}{=}\operatorname{S}_0\mathopen{}\left( t \cdot \theta_{{\lambda}}(\mathord{\smash[b]{\underset{\raise.3ex\hbox{$\scriptstyle\sim$}}{x}}\vphantom{x}}) \right)\mathclose{}
      \qquad(2)$$</w:t>
             </w:r>
-            <w:bookmarkEnd w:id="62"/>
+            <w:bookmarkEnd w:id="63"/>
           </w:p>
           <w:p>
             <w:pPr>
@@ -19369,7 +19460,7 @@
             <w:r>
               <w:t xml:space="preserve"> </w:t>
             </w:r>
-            <w:hyperlink r:id="rId63">
+            <w:hyperlink r:id="rId64">
               <w:r>
                 <w:rPr>
                   <w:rStyle w:val="Hyperlink"/>
@@ -19410,7 +19501,7 @@
               <w:t xml:space="preserve">).</w:t>
             </w:r>
           </w:p>
-          <w:bookmarkEnd w:id="64"/>
+          <w:bookmarkEnd w:id="65"/>
         </w:tc>
       </w:tr>
     </w:tbl>
@@ -19510,7 +19601,7 @@
               <w:spacing w:before="16" w:after="64"/>
             </w:pPr>
           </w:p>
-          <w:bookmarkStart w:id="65" w:name="exm-aft"/>
+          <w:bookmarkStart w:id="66" w:name="exm-aft"/>
           <w:p>
             <w:pPr>
               <w:pStyle w:val="BodyText"/>
@@ -19726,7 +19817,7 @@
               <w:t xml:space="preserve">that a baseline subject has of lasting 40 weeks.</w:t>
             </w:r>
           </w:p>
-          <w:bookmarkEnd w:id="65"/>
+          <w:bookmarkEnd w:id="66"/>
         </w:tc>
       </w:tr>
     </w:tbl>
@@ -19764,7 +19855,7 @@
               <w:spacing w:before="16" w:after="64"/>
             </w:pPr>
           </w:p>
-          <w:bookmarkStart w:id="66" w:name="thm-aft-quantiles"/>
+          <w:bookmarkStart w:id="67" w:name="thm-aft-quantiles"/>
           <w:p>
             <w:pPr>
               <w:pStyle w:val="BodyText"/>
@@ -19978,7 +20069,7 @@
     $$</w:t>
             </w:r>
           </w:p>
-          <w:bookmarkEnd w:id="66"/>
+          <w:bookmarkEnd w:id="67"/>
         </w:tc>
       </w:tr>
     </w:tbl>
@@ -20257,7 +20348,7 @@
               <w:spacing w:before="16" w:after="64"/>
             </w:pPr>
           </w:p>
-          <w:bookmarkStart w:id="67" w:name="exm-aft-quantiles"/>
+          <w:bookmarkStart w:id="68" w:name="exm-aft-quantiles"/>
           <w:p>
             <w:pPr>
               <w:pStyle w:val="BodyText"/>
@@ -21009,7 +21100,7 @@
               <w:t xml:space="preserve">.</w:t>
             </w:r>
           </w:p>
-          <w:bookmarkEnd w:id="67"/>
+          <w:bookmarkEnd w:id="68"/>
         </w:tc>
       </w:tr>
     </w:tbl>
@@ -21093,7 +21184,7 @@
     $$</w:t>
       </w:r>
     </w:p>
-    <w:bookmarkStart w:id="73" w:name="relationship-between-ph-and-aft-models"/>
+    <w:bookmarkStart w:id="74" w:name="relationship-between-ph-and-aft-models"/>
     <w:p>
       <w:pPr>
         <w:pStyle w:val="Heading3"/>
@@ -21266,7 +21357,7 @@
               <w:spacing w:before="16" w:after="64"/>
             </w:pPr>
           </w:p>
-          <w:bookmarkStart w:id="68" w:name="thm-weibull-ph-aft"/>
+          <w:bookmarkStart w:id="69" w:name="thm-weibull-ph-aft"/>
           <w:p>
             <w:pPr>
               <w:pStyle w:val="BodyText"/>
@@ -21726,7 +21817,7 @@
               <w:t xml:space="preserve">.</w:t>
             </w:r>
           </w:p>
-          <w:bookmarkEnd w:id="68"/>
+          <w:bookmarkEnd w:id="69"/>
         </w:tc>
       </w:tr>
     </w:tbl>
@@ -22775,7 +22866,7 @@
               <w:spacing w:before="16" w:after="64"/>
             </w:pPr>
           </w:p>
-          <w:bookmarkStart w:id="69" w:name="exm-weibull-ph-aft"/>
+          <w:bookmarkStart w:id="70" w:name="exm-weibull-ph-aft"/>
           <w:p>
             <w:pPr>
               <w:pStyle w:val="BodyText"/>
@@ -23711,7 +23802,7 @@
               <w:t xml:space="preserve">ages twice as fast as baseline.</w:t>
             </w:r>
           </w:p>
-          <w:bookmarkEnd w:id="69"/>
+          <w:bookmarkEnd w:id="70"/>
         </w:tc>
       </w:tr>
     </w:tbl>
@@ -23749,7 +23840,7 @@
               <w:spacing w:before="16" w:after="64"/>
             </w:pPr>
           </w:p>
-          <w:bookmarkStart w:id="71" w:name="thm-weibull-log-linear"/>
+          <w:bookmarkStart w:id="72" w:name="thm-weibull-log-linear"/>
           <w:p>
             <w:pPr>
               <w:pStyle w:val="BodyText"/>
@@ -24319,7 +24410,7 @@
             <w:pPr>
               <w:pStyle w:val="BodyText"/>
             </w:pPr>
-            <w:bookmarkStart w:id="70" w:name="eq-weibull-log-linear"/>
+            <w:bookmarkStart w:id="71" w:name="eq-weibull-log-linear"/>
             <m:oMathPara>
               <m:oMathParaPr>
                 <m:jc m:val="center"/>
@@ -24387,9 +24478,9 @@
                 </m:r>
               </m:oMath>
             </m:oMathPara>
-            <w:bookmarkEnd w:id="70"/>
+            <w:bookmarkEnd w:id="71"/>
           </w:p>
-          <w:bookmarkEnd w:id="71"/>
+          <w:bookmarkEnd w:id="72"/>
         </w:tc>
       </w:tr>
     </w:tbl>
@@ -26057,7 +26148,7 @@
               <w:spacing w:before="16" w:after="64"/>
             </w:pPr>
           </w:p>
-          <w:bookmarkStart w:id="72" w:name="exm-weibull-log-linear"/>
+          <w:bookmarkStart w:id="73" w:name="exm-weibull-log-linear"/>
           <w:p>
             <w:pPr>
               <w:pStyle w:val="BodyText"/>
@@ -27170,7 +27261,7 @@
               <w:t xml:space="preserve">.</w:t>
             </w:r>
           </w:p>
-          <w:bookmarkEnd w:id="72"/>
+          <w:bookmarkEnd w:id="73"/>
         </w:tc>
       </w:tr>
     </w:tbl>
@@ -27401,9 +27492,9 @@
         <w:t xml:space="preserve">the log-logistic distribution is additionally a proportional-odds model.</w:t>
       </w:r>
     </w:p>
-    <w:bookmarkEnd w:id="73"/>
     <w:bookmarkEnd w:id="74"/>
-    <w:bookmarkStart w:id="85" w:name="dataset-leukemia-treatments"/>
+    <w:bookmarkEnd w:id="75"/>
+    <w:bookmarkStart w:id="86" w:name="dataset-leukemia-treatments"/>
     <w:p>
       <w:pPr>
         <w:pStyle w:val="Heading2"/>
@@ -28332,7 +28423,7 @@
         <w:t xml:space="preserve">(anderson)</w:t>
       </w:r>
     </w:p>
-    <w:bookmarkStart w:id="75" w:name="cox-semi-parametric-model"/>
+    <w:bookmarkStart w:id="76" w:name="cox-semi-parametric-model"/>
     <w:p>
       <w:pPr>
         <w:pStyle w:val="Heading3"/>
@@ -28351,7 +28442,7 @@
       <w:r>
         <w:t xml:space="preserve"> </w:t>
       </w:r>
-      <w:hyperlink r:id="rId59">
+      <w:hyperlink r:id="rId60">
         <w:r>
           <w:rPr>
             <w:rStyle w:val="Hyperlink"/>
@@ -28642,7 +28733,7 @@
       <w:r>
         <w:t xml:space="preserve"> </w:t>
       </w:r>
-      <w:hyperlink r:id="rId56">
+      <w:hyperlink r:id="rId57">
         <w:r>
           <w:rPr>
             <w:rStyle w:val="Hyperlink"/>
@@ -28685,8 +28776,8 @@
         <w:t xml:space="preserve">for standard treatment relative to new treatment is positive, indicating that standard therapy is associated with a higher hazard of relapse (shorter remission duration).</w:t>
       </w:r>
     </w:p>
-    <w:bookmarkEnd w:id="75"/>
-    <w:bookmarkStart w:id="76" w:name="weibull-parametric-model"/>
+    <w:bookmarkEnd w:id="76"/>
+    <w:bookmarkStart w:id="77" w:name="weibull-parametric-model"/>
     <w:p>
       <w:pPr>
         <w:pStyle w:val="Heading3"/>
@@ -29179,8 +29270,8 @@
         <w:t xml:space="preserve">.</w:t>
       </w:r>
     </w:p>
-    <w:bookmarkEnd w:id="76"/>
-    <w:bookmarkStart w:id="79" w:name="exponential-parametric-model"/>
+    <w:bookmarkEnd w:id="77"/>
+    <w:bookmarkStart w:id="80" w:name="exponential-parametric-model"/>
     <w:p>
       <w:pPr>
         <w:pStyle w:val="Heading3"/>
@@ -29611,7 +29702,7 @@
               <w:spacing w:before="16" w:after="64"/>
             </w:pPr>
           </w:p>
-          <w:bookmarkStart w:id="78" w:name="exm-anderson-exp-mle"/>
+          <w:bookmarkStart w:id="79" w:name="exm-anderson-exp-mle"/>
           <w:p>
             <w:pPr>
               <w:pStyle w:val="BodyText"/>
@@ -29632,7 +29723,7 @@
             <w:r>
               <w:t xml:space="preserve"> </w:t>
             </w:r>
-            <w:hyperlink r:id="rId77">
+            <w:hyperlink r:id="rId78">
               <w:r>
                 <w:rPr>
                   <w:rStyle w:val="Hyperlink"/>
@@ -30494,12 +30585,12 @@
               <w:t xml:space="preserve">the log of the estimated mean remission time on the new treatment.</w:t>
             </w:r>
           </w:p>
-          <w:bookmarkEnd w:id="78"/>
+          <w:bookmarkEnd w:id="79"/>
         </w:tc>
       </w:tr>
     </w:tbl>
-    <w:bookmarkEnd w:id="79"/>
-    <w:bookmarkStart w:id="84" w:name="X17d47832817468ce7bfe052ef3569a8fbc40990"/>
+    <w:bookmarkEnd w:id="80"/>
+    <w:bookmarkStart w:id="85" w:name="X17d47832817468ce7bfe052ef3569a8fbc40990"/>
     <w:p>
       <w:pPr>
         <w:pStyle w:val="Heading3"/>
@@ -30518,7 +30609,7 @@
       <w:r>
         <w:t xml:space="preserve"> </w:t>
       </w:r>
-      <w:hyperlink r:id="rId57">
+      <w:hyperlink r:id="rId58">
         <w:r>
           <w:rPr>
             <w:rStyle w:val="Hyperlink"/>
@@ -30535,7 +30626,7 @@
       <w:r>
         <w:t xml:space="preserve"> </w:t>
       </w:r>
-      <w:hyperlink r:id="rId80">
+      <w:hyperlink r:id="rId81">
         <w:r>
           <w:rPr>
             <w:rStyle w:val="Hyperlink"/>
@@ -31550,18 +31641,18 @@
           <wp:inline>
             <wp:extent cx="4620126" cy="3696101"/>
             <wp:effectExtent b="0" l="0" r="0" t="0"/>
-            <wp:docPr descr="Cumulative hazard curves by treatment group, on log-spaced axes (complementary log-log survival curves)" title="" id="82" name="Picture"/>
+            <wp:docPr descr="Cumulative hazard curves by treatment group, on log-spaced axes (complementary log-log survival curves)" title="" id="83" name="Picture"/>
             <a:graphic>
               <a:graphicData uri="http://schemas.openxmlformats.org/drawingml/2006/picture">
                 <pic:pic>
                   <pic:nvPicPr>
-                    <pic:cNvPr descr="parametric-survival-models_files/figure-docx/unnamed-chunk-7-1.png" id="83" name="Picture"/>
+                    <pic:cNvPr descr="parametric-survival-models_files/figure-docx/unnamed-chunk-7-1.png" id="84" name="Picture"/>
                     <pic:cNvPicPr>
                       <a:picLocks noChangeArrowheads="1" noChangeAspect="1"/>
                     </pic:cNvPicPr>
                   </pic:nvPicPr>
                   <pic:blipFill>
-                    <a:blip r:embed="rId81"/>
+                    <a:blip r:embed="rId82"/>
                     <a:stretch>
                       <a:fillRect/>
                     </a:stretch>
@@ -31604,10 +31695,10 @@
         <w:t xml:space="preserve">If the complementary log-log curves are approximately linear and parallel across treatment groups, then a Weibull proportional hazards model is appropriate.</w:t>
       </w:r>
     </w:p>
-    <w:bookmarkEnd w:id="84"/>
     <w:bookmarkEnd w:id="85"/>
     <w:bookmarkEnd w:id="86"/>
-    <w:bookmarkStart w:id="99" w:name="X80644eccb1ff2ccaedca6367f2aaff59ae21cdf"/>
+    <w:bookmarkEnd w:id="87"/>
+    <w:bookmarkStart w:id="100" w:name="X80644eccb1ff2ccaedca6367f2aaff59ae21cdf"/>
     <w:p>
       <w:pPr>
         <w:pStyle w:val="Heading1"/>
@@ -31626,7 +31717,7 @@
       <w:r>
         <w:t xml:space="preserve"> </w:t>
       </w:r>
-      <w:hyperlink r:id="rId87">
+      <w:hyperlink r:id="rId88">
         <w:r>
           <w:rPr>
             <w:rStyle w:val="Hyperlink"/>
@@ -31645,7 +31736,7 @@
       <w:r>
         <w:t xml:space="preserve"> </w:t>
       </w:r>
-      <w:hyperlink r:id="rId88">
+      <w:hyperlink r:id="rId89">
         <w:r>
           <w:rPr>
             <w:rStyle w:val="Hyperlink"/>
@@ -31667,7 +31758,7 @@
       <w:r>
         <w:t xml:space="preserve"> </w:t>
       </w:r>
-      <w:hyperlink r:id="rId89">
+      <w:hyperlink r:id="rId90">
         <w:r>
           <w:rPr>
             <w:rStyle w:val="Hyperlink"/>
@@ -31844,7 +31935,7 @@
       <w:r>
         <w:t xml:space="preserve"> </w:t>
       </w:r>
-      <w:hyperlink r:id="rId90">
+      <w:hyperlink r:id="rId91">
         <w:r>
           <w:rPr>
             <w:rStyle w:val="Hyperlink"/>
@@ -31928,7 +32019,7 @@
       <w:r>
         <w:t xml:space="preserve"> </w:t>
       </w:r>
-      <w:hyperlink r:id="rId91">
+      <w:hyperlink r:id="rId92">
         <w:r>
           <w:rPr>
             <w:rStyle w:val="Hyperlink"/>
@@ -31983,7 +32074,7 @@
       <w:r>
         <w:t xml:space="preserve"> </w:t>
       </w:r>
-      <w:hyperlink r:id="rId92">
+      <w:hyperlink r:id="rId93">
         <w:r>
           <w:rPr>
             <w:rStyle w:val="Hyperlink"/>
@@ -32354,8 +32445,8 @@
         <w:t xml:space="preserve">so it supports neither regression nor truncation.</w:t>
       </w:r>
     </w:p>
-    <w:bookmarkStart w:id="98" w:name="refs"/>
-    <w:bookmarkStart w:id="94" w:name="ref-rocke2021epi204"/>
+    <w:bookmarkStart w:id="99" w:name="refs"/>
+    <w:bookmarkStart w:id="95" w:name="ref-rocke2021epi204"/>
     <w:p>
       <w:pPr>
         <w:pStyle w:val="Bibliography"/>
@@ -32408,7 +32499,7 @@
       <w:r>
         <w:t xml:space="preserve"> </w:t>
       </w:r>
-      <w:hyperlink r:id="rId93">
+      <w:hyperlink r:id="rId94">
         <w:r>
           <w:rPr>
             <w:rStyle w:val="Hyperlink"/>
@@ -32417,8 +32508,8 @@
         </w:r>
       </w:hyperlink>
     </w:p>
-    <w:bookmarkEnd w:id="94"/>
-    <w:bookmarkStart w:id="95" w:name="ref-kalbfleisch2011statistical"/>
+    <w:bookmarkEnd w:id="95"/>
+    <w:bookmarkStart w:id="96" w:name="ref-kalbfleisch2011statistical"/>
     <w:p>
       <w:pPr>
         <w:pStyle w:val="Bibliography"/>
@@ -32449,8 +32540,8 @@
         <w:t xml:space="preserve">. John Wiley &amp; Sons, 2011.</w:t>
       </w:r>
     </w:p>
-    <w:bookmarkEnd w:id="95"/>
-    <w:bookmarkStart w:id="97" w:name="ref-fay2010exact"/>
+    <w:bookmarkEnd w:id="96"/>
+    <w:bookmarkStart w:id="98" w:name="ref-fay2010exact"/>
     <w:p>
       <w:pPr>
         <w:pStyle w:val="Bibliography"/>
@@ -32507,7 +32598,7 @@
       <w:r>
         <w:t xml:space="preserve"> </w:t>
       </w:r>
-      <w:hyperlink r:id="rId96">
+      <w:hyperlink r:id="rId97">
         <w:r>
           <w:rPr>
             <w:rStyle w:val="Hyperlink"/>
@@ -32519,9 +32610,9 @@
         <w:t xml:space="preserve">.</w:t>
       </w:r>
     </w:p>
-    <w:bookmarkEnd w:id="97"/>
     <w:bookmarkEnd w:id="98"/>
     <w:bookmarkEnd w:id="99"/>
+    <w:bookmarkEnd w:id="100"/>
     <w:sectPr>
       <w:footnotePr>
         <w:numRestart w:val="eachSect"/>

</xml_diff>